<commit_message>
Add KDP full-wrap cover for Book 1
- 17.325 x 11.25 in (8.5 x 11 trim, 0.125 in bleed, 0.0751 in spine
  for 32 pages, premium color on white paper).
- Author banner relettered "By LeTisha C. Cleveland" to match the
  interior.
- Invalid placeholder ISBN and barcode covered with a white box that
  contains KDP's barcode position, so KDP can print a free-ISBN barcode.
- Spine filled from the adjoining panel edges; panels enlarged to 300 ppi.

Co-Authored-By: Claude Opus 5.5 <noreply@anthropic.com>
Claude-Session: https://claude.ai/code/session_01MoWmDNVtH34VN9ywvoYJRo
</commit_message>
<xml_diff>
--- a/deliverables/04_Open_Issues_For_Approval.docx
+++ b/deliverables/04_Open_Issues_For_Approval.docx
@@ -2213,13 +2213,594 @@
     </w:p>
     <w:bookmarkEnd w:id="28"/>
     <w:bookmarkEnd w:id="29"/>
-    <w:bookmarkStart w:id="30" w:name="d.-cover-separate-file-not-changed"/>
+    <w:bookmarkStart w:id="30" w:name="Xd89913f76232398a6fb74cc4ca52ee2bff0d45f"/>
     <w:p>
       <w:pPr>
         <w:pStyle w:val="Heading2"/>
       </w:pPr>
       <w:r>
-        <w:t xml:space="preserve">D. Cover (separate file, not changed)</w:t>
+        <w:t xml:space="preserve">D. Cover: ✅ formatted (</w:t>
+      </w:r>
+      <w:r>
+        <w:rPr>
+          <w:rStyle w:val="VerbatimChar"/>
+        </w:rPr>
+        <w:t xml:space="preserve">05_KDP_Cover_Joesiah_Malani_Book1.pdf</w:t>
+      </w:r>
+      <w:r>
+        <w:t xml:space="preserve">)</w:t>
+      </w:r>
+    </w:p>
+    <w:p>
+      <w:pPr>
+        <w:pStyle w:val="FirstParagraph"/>
+      </w:pPr>
+      <w:r>
+        <w:t xml:space="preserve">Built from your cover draft. The cover artwork itself was not changed except where noted below.</w:t>
+      </w:r>
+    </w:p>
+    <w:tbl>
+      <w:tblPr>
+        <w:tblStyle w:val="Table"/>
+        <w:tblW w:type="pct" w:w="5000"/>
+        <w:tblLook w:firstRow="1" w:lastRow="0" w:firstColumn="0" w:lastColumn="0" w:noHBand="0" w:noVBand="0" w:val="0020"/>
+        <w:jc w:val="start"/>
+      </w:tblPr>
+      <w:tblGrid>
+        <w:gridCol w:w="3960"/>
+        <w:gridCol w:w="3960"/>
+      </w:tblGrid>
+      <w:tr>
+        <w:trPr>
+          <w:tblHeader w:val="true"/>
+        </w:trPr>
+        <w:tc>
+          <w:tcPr/>
+          <w:p>
+            <w:pPr>
+              <w:pStyle w:val="Compact"/>
+              <w:jc w:val="left"/>
+            </w:pPr>
+            <w:r>
+              <w:t xml:space="preserve">Item</w:t>
+            </w:r>
+          </w:p>
+        </w:tc>
+        <w:tc>
+          <w:tcPr/>
+          <w:p>
+            <w:pPr>
+              <w:pStyle w:val="Compact"/>
+              <w:jc w:val="left"/>
+            </w:pPr>
+            <w:r>
+              <w:t xml:space="preserve">Result</w:t>
+            </w:r>
+          </w:p>
+        </w:tc>
+      </w:tr>
+      <w:tr>
+        <w:tc>
+          <w:tcPr/>
+          <w:p>
+            <w:pPr>
+              <w:pStyle w:val="Compact"/>
+              <w:jc w:val="left"/>
+            </w:pPr>
+            <w:r>
+              <w:t xml:space="preserve">Size</w:t>
+            </w:r>
+          </w:p>
+        </w:tc>
+        <w:tc>
+          <w:tcPr/>
+          <w:p>
+            <w:pPr>
+              <w:pStyle w:val="Compact"/>
+              <w:jc w:val="left"/>
+            </w:pPr>
+            <w:r>
+              <w:rPr>
+                <w:bCs/>
+                <w:b/>
+              </w:rPr>
+              <w:t xml:space="preserve">17.325 × 11.25 in</w:t>
+            </w:r>
+            <w:r>
+              <w:t xml:space="preserve">. Back (8.5 in) + spine (0.0751 in) + front (8.5 in), plus 0.125 in bleed all round. Calculated for</w:t>
+            </w:r>
+            <w:r>
+              <w:t xml:space="preserve"> </w:t>
+            </w:r>
+            <w:r>
+              <w:rPr>
+                <w:bCs/>
+                <w:b/>
+              </w:rPr>
+              <w:t xml:space="preserve">32 pages</w:t>
+            </w:r>
+            <w:r>
+              <w:t xml:space="preserve">: KDP counts the 31-page interior as 32 after adding a blank page.</w:t>
+            </w:r>
+          </w:p>
+        </w:tc>
+      </w:tr>
+      <w:tr>
+        <w:tc>
+          <w:tcPr/>
+          <w:p>
+            <w:pPr>
+              <w:pStyle w:val="Compact"/>
+              <w:jc w:val="left"/>
+            </w:pPr>
+            <w:r>
+              <w:t xml:space="preserve">Author</w:t>
+            </w:r>
+          </w:p>
+        </w:tc>
+        <w:tc>
+          <w:tcPr/>
+          <w:p>
+            <w:pPr>
+              <w:pStyle w:val="Compact"/>
+              <w:jc w:val="left"/>
+            </w:pPr>
+            <w:r>
+              <w:t xml:space="preserve">Banner relettered to</w:t>
+            </w:r>
+            <w:r>
+              <w:t xml:space="preserve"> </w:t>
+            </w:r>
+            <w:r>
+              <w:rPr>
+                <w:bCs/>
+                <w:b/>
+              </w:rPr>
+              <w:t xml:space="preserve">“</w:t>
+            </w:r>
+            <w:r>
+              <w:rPr>
+                <w:bCs/>
+                <w:b/>
+              </w:rPr>
+              <w:t xml:space="preserve">By LeTisha C. Cleveland</w:t>
+            </w:r>
+            <w:r>
+              <w:rPr>
+                <w:bCs/>
+                <w:b/>
+              </w:rPr>
+              <w:t xml:space="preserve">”</w:t>
+            </w:r>
+            <w:r>
+              <w:t xml:space="preserve">, in matching gold. It now matches the interior.</w:t>
+            </w:r>
+          </w:p>
+        </w:tc>
+      </w:tr>
+      <w:tr>
+        <w:tc>
+          <w:tcPr/>
+          <w:p>
+            <w:pPr>
+              <w:pStyle w:val="Compact"/>
+              <w:jc w:val="left"/>
+            </w:pPr>
+            <w:r>
+              <w:t xml:space="preserve">ISBN</w:t>
+            </w:r>
+          </w:p>
+        </w:tc>
+        <w:tc>
+          <w:tcPr/>
+          <w:p>
+            <w:pPr>
+              <w:pStyle w:val="Compact"/>
+              <w:jc w:val="left"/>
+            </w:pPr>
+            <w:r>
+              <w:t xml:space="preserve">The placeholder</w:t>
+            </w:r>
+            <w:r>
+              <w:t xml:space="preserve"> </w:t>
+            </w:r>
+            <w:r>
+              <w:t xml:space="preserve">“</w:t>
+            </w:r>
+            <w:r>
+              <w:t xml:space="preserve">ISBN 978-1-736274-00-0</w:t>
+            </w:r>
+            <w:r>
+              <w:t xml:space="preserve">”</w:t>
+            </w:r>
+            <w:r>
+              <w:t xml:space="preserve"> </w:t>
+            </w:r>
+            <w:r>
+              <w:t xml:space="preserve">(not a valid number) and its fake barcode are</w:t>
+            </w:r>
+            <w:r>
+              <w:t xml:space="preserve"> </w:t>
+            </w:r>
+            <w:r>
+              <w:rPr>
+                <w:bCs/>
+                <w:b/>
+              </w:rPr>
+              <w:t xml:space="preserve">covered by a clean white box</w:t>
+            </w:r>
+            <w:r>
+              <w:t xml:space="preserve">. The box includes KDP’s barcode spot (2 × 1.2 in, 0.25 in from the spine and bottom edge), so</w:t>
+            </w:r>
+            <w:r>
+              <w:t xml:space="preserve"> </w:t>
+            </w:r>
+            <w:r>
+              <w:rPr>
+                <w:bCs/>
+                <w:b/>
+              </w:rPr>
+              <w:t xml:space="preserve">KDP prints the real barcode there</w:t>
+            </w:r>
+            <w:r>
+              <w:t xml:space="preserve"> </w:t>
+            </w:r>
+            <w:r>
+              <w:t xml:space="preserve">for its free ISBN.</w:t>
+            </w:r>
+          </w:p>
+        </w:tc>
+      </w:tr>
+      <w:tr>
+        <w:tc>
+          <w:tcPr/>
+          <w:p>
+            <w:pPr>
+              <w:pStyle w:val="Compact"/>
+              <w:jc w:val="left"/>
+            </w:pPr>
+            <w:r>
+              <w:t xml:space="preserve">Spine</w:t>
+            </w:r>
+          </w:p>
+        </w:tc>
+        <w:tc>
+          <w:tcPr/>
+          <w:p>
+            <w:pPr>
+              <w:pStyle w:val="Compact"/>
+              <w:jc w:val="left"/>
+            </w:pPr>
+            <w:r>
+              <w:t xml:space="preserve">No text, which is correct: KDP only allows spine text on books over 79 pages. The spine is filled from the edges of the front and back art, so a small printing shift won’t show a stripe.</w:t>
+            </w:r>
+          </w:p>
+        </w:tc>
+      </w:tr>
+      <w:tr>
+        <w:tc>
+          <w:tcPr/>
+          <w:p>
+            <w:pPr>
+              <w:pStyle w:val="Compact"/>
+              <w:jc w:val="left"/>
+            </w:pPr>
+            <w:r>
+              <w:t xml:space="preserve">Safe zone</w:t>
+            </w:r>
+          </w:p>
+        </w:tc>
+        <w:tc>
+          <w:tcPr/>
+          <w:p>
+            <w:pPr>
+              <w:pStyle w:val="Compact"/>
+              <w:jc w:val="left"/>
+            </w:pPr>
+            <w:r>
+              <w:t xml:space="preserve">All cover text is at least 0.15 in inside the trim (KDP minimum 0.125 in). The closest items are the back-cover headline and the crown on the front.</w:t>
+            </w:r>
+          </w:p>
+        </w:tc>
+      </w:tr>
+      <w:tr>
+        <w:tc>
+          <w:tcPr/>
+          <w:p>
+            <w:pPr>
+              <w:pStyle w:val="Compact"/>
+              <w:jc w:val="left"/>
+            </w:pPr>
+            <w:r>
+              <w:t xml:space="preserve">Fonts</w:t>
+            </w:r>
+          </w:p>
+        </w:tc>
+        <w:tc>
+          <w:tcPr/>
+          <w:p>
+            <w:pPr>
+              <w:pStyle w:val="Compact"/>
+              <w:jc w:val="left"/>
+            </w:pPr>
+            <w:r>
+              <w:t xml:space="preserve">No live text in the PDF, so there’s nothing to embed.</w:t>
+            </w:r>
+          </w:p>
+        </w:tc>
+      </w:tr>
+      <w:tr>
+        <w:tc>
+          <w:tcPr/>
+          <w:p>
+            <w:pPr>
+              <w:pStyle w:val="Compact"/>
+              <w:jc w:val="left"/>
+            </w:pPr>
+            <w:r>
+              <w:t xml:space="preserve">Resolution</w:t>
+            </w:r>
+          </w:p>
+        </w:tc>
+        <w:tc>
+          <w:tcPr/>
+          <w:p>
+            <w:pPr>
+              <w:pStyle w:val="Compact"/>
+              <w:jc w:val="left"/>
+            </w:pPr>
+            <w:r>
+              <w:t xml:space="preserve">⚠️ The draft artwork is only 738 × 1024 px (about 86 DPI). I enlarged it to 300 DPI with high-quality resampling. It passes KDP’s check, but the</w:t>
+            </w:r>
+            <w:r>
+              <w:t xml:space="preserve"> </w:t>
+            </w:r>
+            <w:r>
+              <w:rPr>
+                <w:bCs/>
+                <w:b/>
+              </w:rPr>
+              <w:t xml:space="preserve">cover will print noticeably softer than the interior</w:t>
+            </w:r>
+            <w:r>
+              <w:t xml:space="preserve">. This is the most visible part of the book, so check it carefully in the printed proof.</w:t>
+            </w:r>
+          </w:p>
+        </w:tc>
+      </w:tr>
+    </w:tbl>
+    <w:p>
+      <w:pPr>
+        <w:pStyle w:val="BodyText"/>
+      </w:pPr>
+      <w:r>
+        <w:rPr>
+          <w:bCs/>
+          <w:b/>
+        </w:rPr>
+        <w:t xml:space="preserve">Your choices when you set up the book in KDP:</w:t>
+      </w:r>
+      <w:r>
+        <w:t xml:space="preserve"> </w:t>
+      </w:r>
+      <w:r>
+        <w:t xml:space="preserve">-</w:t>
+      </w:r>
+      <w:r>
+        <w:t xml:space="preserve"> </w:t>
+      </w:r>
+      <w:r>
+        <w:rPr>
+          <w:bCs/>
+          <w:b/>
+        </w:rPr>
+        <w:t xml:space="preserve">Paperback content → ISBN:</w:t>
+      </w:r>
+      <w:r>
+        <w:t xml:space="preserve"> </w:t>
+      </w:r>
+      <w:r>
+        <w:t xml:space="preserve">choose</w:t>
+      </w:r>
+      <w:r>
+        <w:t xml:space="preserve"> </w:t>
+      </w:r>
+      <w:r>
+        <w:t xml:space="preserve">“</w:t>
+      </w:r>
+      <w:r>
+        <w:t xml:space="preserve">Get a free KDP ISBN</w:t>
+      </w:r>
+      <w:r>
+        <w:t xml:space="preserve">”</w:t>
+      </w:r>
+      <w:r>
+        <w:t xml:space="preserve">. Your cover is ready for KDP’s barcode.</w:t>
+      </w:r>
+      <w:r>
+        <w:t xml:space="preserve"> </w:t>
+      </w:r>
+      <w:r>
+        <w:t xml:space="preserve">-</w:t>
+      </w:r>
+      <w:r>
+        <w:t xml:space="preserve"> </w:t>
+      </w:r>
+      <w:r>
+        <w:rPr>
+          <w:bCs/>
+          <w:b/>
+        </w:rPr>
+        <w:t xml:space="preserve">If you buy your own ISBN instead:</w:t>
+      </w:r>
+      <w:r>
+        <w:t xml:space="preserve"> </w:t>
+      </w:r>
+      <w:r>
+        <w:t xml:space="preserve">tell me the number. I’ll put its real barcode in the white box.</w:t>
+      </w:r>
+      <w:r>
+        <w:t xml:space="preserve"> </w:t>
+      </w:r>
+      <w:r>
+        <w:t xml:space="preserve">-</w:t>
+      </w:r>
+      <w:r>
+        <w:t xml:space="preserve"> </w:t>
+      </w:r>
+      <w:r>
+        <w:rPr>
+          <w:bCs/>
+          <w:b/>
+        </w:rPr>
+        <w:t xml:space="preserve">Cover →</w:t>
+      </w:r>
+      <w:r>
+        <w:rPr>
+          <w:bCs/>
+          <w:b/>
+        </w:rPr>
+        <w:t xml:space="preserve"> </w:t>
+      </w:r>
+      <w:r>
+        <w:rPr>
+          <w:bCs/>
+          <w:b/>
+        </w:rPr>
+        <w:t xml:space="preserve">“</w:t>
+      </w:r>
+      <w:r>
+        <w:rPr>
+          <w:bCs/>
+          <w:b/>
+        </w:rPr>
+        <w:t xml:space="preserve">Upload a cover you already have</w:t>
+      </w:r>
+      <w:r>
+        <w:rPr>
+          <w:bCs/>
+          <w:b/>
+        </w:rPr>
+        <w:t xml:space="preserve">”</w:t>
+      </w:r>
+      <w:r>
+        <w:t xml:space="preserve">, then choose</w:t>
+      </w:r>
+      <w:r>
+        <w:t xml:space="preserve"> </w:t>
+      </w:r>
+      <w:r>
+        <w:rPr>
+          <w:rStyle w:val="VerbatimChar"/>
+        </w:rPr>
+        <w:t xml:space="preserve">05_KDP_Cover_Joesiah_Malani_Book1.pdf</w:t>
+      </w:r>
+      <w:r>
+        <w:t xml:space="preserve">.</w:t>
+      </w:r>
+      <w:r>
+        <w:t xml:space="preserve"> </w:t>
+      </w:r>
+      <w:r>
+        <w:t xml:space="preserve">-</w:t>
+      </w:r>
+      <w:r>
+        <w:t xml:space="preserve"> </w:t>
+      </w:r>
+      <w:r>
+        <w:rPr>
+          <w:bCs/>
+          <w:b/>
+        </w:rPr>
+        <w:t xml:space="preserve">Glossy finish.</w:t>
+      </w:r>
+      <w:r>
+        <w:t xml:space="preserve"> </w:t>
+      </w:r>
+      <w:r>
+        <w:t xml:space="preserve">If the previewer reports a size mismatch, your final page count differs from 32. Tell me the number KDP shows and I’ll resize.</w:t>
+      </w:r>
+    </w:p>
+    <w:p>
+      <w:pPr>
+        <w:pStyle w:val="BodyText"/>
+      </w:pPr>
+      <w:r>
+        <w:rPr>
+          <w:bCs/>
+          <w:b/>
+        </w:rPr>
+        <w:t xml:space="preserve">Optional wording on the cover (not changed):</w:t>
+      </w:r>
+      <w:r>
+        <w:t xml:space="preserve"> </w:t>
+      </w:r>
+      <w:r>
+        <w:t xml:space="preserve">- The back-cover motto (</w:t>
+      </w:r>
+      <w:r>
+        <w:t xml:space="preserve">“</w:t>
+      </w:r>
+      <w:r>
+        <w:t xml:space="preserve">Know Your History. Be Proud of Your Story. Walk in Your Purpose.</w:t>
+      </w:r>
+      <w:r>
+        <w:t xml:space="preserve">”</w:t>
+      </w:r>
+      <w:r>
+        <w:t xml:space="preserve">) differs from the motto inside the book.</w:t>
+      </w:r>
+      <w:r>
+        <w:t xml:space="preserve"> </w:t>
+      </w:r>
+      <w:r>
+        <w:t xml:space="preserve">- The back cover says the children</w:t>
+      </w:r>
+      <w:r>
+        <w:t xml:space="preserve"> </w:t>
+      </w:r>
+      <w:r>
+        <w:t xml:space="preserve">“</w:t>
+      </w:r>
+      <w:r>
+        <w:t xml:space="preserve">travel back in time with Grandma</w:t>
+      </w:r>
+      <w:r>
+        <w:t xml:space="preserve">”</w:t>
+      </w:r>
+      <w:r>
+        <w:t xml:space="preserve">. That’s fine if time travel is part of the story’s concept. It doesn’t repeat the old series name.</w:t>
+      </w:r>
+      <w:r>
+        <w:t xml:space="preserve"> </w:t>
+      </w:r>
+      <w:r>
+        <w:t xml:space="preserve">- The front cover doesn’t say</w:t>
+      </w:r>
+      <w:r>
+        <w:t xml:space="preserve"> </w:t>
+      </w:r>
+      <w:r>
+        <w:t xml:space="preserve">“</w:t>
+      </w:r>
+      <w:r>
+        <w:t xml:space="preserve">Book 1</w:t>
+      </w:r>
+      <w:r>
+        <w:t xml:space="preserve">”</w:t>
+      </w:r>
+      <w:r>
+        <w:t xml:space="preserve">. It’s optional, and can be added under the title if you want.</w:t>
+      </w:r>
+    </w:p>
+    <w:bookmarkEnd w:id="30"/>
+    <w:bookmarkStart w:id="31" w:name="X24b36e912db8f246a1587d13fa2d01db15236b4"/>
+    <w:p>
+      <w:pPr>
+        <w:pStyle w:val="Heading2"/>
+      </w:pPr>
+      <w:r>
+        <w:t xml:space="preserve">E. Optional editorial suggestions (not applied)</w:t>
       </w:r>
     </w:p>
     <w:p>
@@ -2231,11 +2812,189 @@
         <w:pStyle w:val="Compact"/>
       </w:pPr>
       <w:r>
-        <w:rPr>
-          <w:bCs/>
-          <w:b/>
-        </w:rPr>
-        <w:t xml:space="preserve">ISBN:</w:t>
+        <w:t xml:space="preserve">✅</w:t>
+      </w:r>
+      <w:r>
+        <w:t xml:space="preserve"> </w:t>
+      </w:r>
+      <w:r>
+        <w:rPr>
+          <w:bCs/>
+          <w:b/>
+        </w:rPr>
+        <w:t xml:space="preserve">Chapter 4 (done):</w:t>
+      </w:r>
+      <w:r>
+        <w:t xml:space="preserve"> </w:t>
+      </w:r>
+      <w:r>
+        <w:t xml:space="preserve">The text now explains Put and makes the Africa link clear:</w:t>
+      </w:r>
+      <w:r>
+        <w:t xml:space="preserve"> </w:t>
+      </w:r>
+      <w:r>
+        <w:t xml:space="preserve">“</w:t>
+      </w:r>
+      <w:r>
+        <w:t xml:space="preserve">Put is often associated with lands west of Egypt, such as ancient Libya. So three of Ham’s sons—Cush, Mizraim, and Put—are linked with lands in Africa. Canaan’s family settled in the land of Canaan, northeast of Egypt.</w:t>
+      </w:r>
+      <w:r>
+        <w:t xml:space="preserve">”</w:t>
+      </w:r>
+      <w:r>
+        <w:t xml:space="preserve"> </w:t>
+      </w:r>
+      <w:r>
+        <w:t xml:space="preserve">It also has an</w:t>
+      </w:r>
+      <w:r>
+        <w:t xml:space="preserve"> </w:t>
+      </w:r>
+      <w:r>
+        <w:rPr>
+          <w:bCs/>
+          <w:b/>
+        </w:rPr>
+        <w:t xml:space="preserve">“</w:t>
+      </w:r>
+      <w:r>
+        <w:rPr>
+          <w:bCs/>
+          <w:b/>
+        </w:rPr>
+        <w:t xml:space="preserve">On Today’s Map</w:t>
+      </w:r>
+      <w:r>
+        <w:rPr>
+          <w:bCs/>
+          <w:b/>
+        </w:rPr>
+        <w:t xml:space="preserve">”</w:t>
+      </w:r>
+      <w:r>
+        <w:t xml:space="preserve"> </w:t>
+      </w:r>
+      <w:r>
+        <w:t xml:space="preserve">box: Cush (Kush, Nubia) = Sudan and southern Egypt; Mizraim = Egypt; Put = Libya; Canaan = Israel, the Palestinian territories (the West Bank and Gaza), Lebanon, and parts of Syria and Jordan.</w:t>
+      </w:r>
+    </w:p>
+    <w:p>
+      <w:pPr>
+        <w:numPr>
+          <w:ilvl w:val="0"/>
+          <w:numId w:val="1007"/>
+        </w:numPr>
+        <w:pStyle w:val="Compact"/>
+      </w:pPr>
+      <w:r>
+        <w:rPr>
+          <w:bCs/>
+          <w:b/>
+        </w:rPr>
+        <w:t xml:space="preserve">Chapter 5:</w:t>
+      </w:r>
+      <w:r>
+        <w:t xml:space="preserve"> </w:t>
+      </w:r>
+      <w:r>
+        <w:t xml:space="preserve">“</w:t>
+      </w:r>
+      <w:r>
+        <w:t xml:space="preserve">divinely destined for servitude</w:t>
+      </w:r>
+      <w:r>
+        <w:t xml:space="preserve">”</w:t>
+      </w:r>
+      <w:r>
+        <w:t xml:space="preserve"> </w:t>
+      </w:r>
+      <w:r>
+        <w:t xml:space="preserve">is hard vocabulary for ages 8–12. A suggested alternative:</w:t>
+      </w:r>
+      <w:r>
+        <w:t xml:space="preserve"> </w:t>
+      </w:r>
+      <w:r>
+        <w:t xml:space="preserve">“</w:t>
+      </w:r>
+      <w:r>
+        <w:t xml:space="preserve">used to claim that God meant African people to be enslaved, and to defend racial slavery.</w:t>
+      </w:r>
+      <w:r>
+        <w:t xml:space="preserve">”</w:t>
+      </w:r>
+    </w:p>
+    <w:p>
+      <w:pPr>
+        <w:numPr>
+          <w:ilvl w:val="0"/>
+          <w:numId w:val="1007"/>
+        </w:numPr>
+        <w:pStyle w:val="Compact"/>
+      </w:pPr>
+      <w:r>
+        <w:rPr>
+          <w:bCs/>
+          <w:b/>
+        </w:rPr>
+        <w:t xml:space="preserve">Chapter 9</w:t>
+      </w:r>
+      <w:r>
+        <w:t xml:space="preserve"> </w:t>
+      </w:r>
+      <w:r>
+        <w:t xml:space="preserve">repeats Chapter 8’s sentence about Egypt already having rulers, cities and agriculture. You could shorten it to one line.</w:t>
+      </w:r>
+    </w:p>
+    <w:p>
+      <w:pPr>
+        <w:numPr>
+          <w:ilvl w:val="0"/>
+          <w:numId w:val="1007"/>
+        </w:numPr>
+        <w:pStyle w:val="Compact"/>
+      </w:pPr>
+      <w:r>
+        <w:rPr>
+          <w:bCs/>
+          <w:b/>
+        </w:rPr>
+        <w:t xml:space="preserve">“</w:t>
+      </w:r>
+      <w:r>
+        <w:rPr>
+          <w:bCs/>
+          <w:b/>
+        </w:rPr>
+        <w:t xml:space="preserve">Read it for yourself</w:t>
+      </w:r>
+      <w:r>
+        <w:rPr>
+          <w:bCs/>
+          <w:b/>
+        </w:rPr>
+        <w:t xml:space="preserve">”</w:t>
+      </w:r>
+      <w:r>
+        <w:rPr>
+          <w:bCs/>
+          <w:b/>
+        </w:rPr>
+        <w:t xml:space="preserve"> </w:t>
+      </w:r>
+      <w:r>
+        <w:rPr>
+          <w:bCs/>
+          <w:b/>
+        </w:rPr>
+        <w:t xml:space="preserve">lines</w:t>
+      </w:r>
+      <w:r>
+        <w:t xml:space="preserve"> </w:t>
+      </w:r>
+      <w:r>
+        <w:t xml:space="preserve">are missing from Chapters 4, 7, 8, 12, 13 and 14. Suggested additions:</w:t>
       </w:r>
     </w:p>
     <w:p>
@@ -2247,20 +3006,7 @@
         <w:pStyle w:val="Compact"/>
       </w:pPr>
       <w:r>
-        <w:t xml:space="preserve">The cover prints ISBN</w:t>
-      </w:r>
-      <w:r>
-        <w:t xml:space="preserve"> </w:t>
-      </w:r>
-      <w:r>
-        <w:rPr>
-          <w:bCs/>
-          <w:b/>
-        </w:rPr>
-        <w:t xml:space="preserve">978-1-736274-00-0</w:t>
-      </w:r>
-      <w:r>
-        <w:t xml:space="preserve">. That number fails the ISBN check-digit test; with that prefix, the last digit would have to be 2. It looks like a placeholder.</w:t>
+        <w:t xml:space="preserve">Chapter 4: Genesis 10:6–20</w:t>
       </w:r>
     </w:p>
     <w:p>
@@ -2272,7 +3018,61 @@
         <w:pStyle w:val="Compact"/>
       </w:pPr>
       <w:r>
-        <w:t xml:space="preserve">Use your real ISBN (KDP’s free one, or your own) and make sure it matches the KDP listing.</w:t>
+        <w:t xml:space="preserve">Chapter 12: Genesis 42–50</w:t>
+      </w:r>
+    </w:p>
+    <w:p>
+      <w:pPr>
+        <w:numPr>
+          <w:ilvl w:val="1"/>
+          <w:numId w:val="1008"/>
+        </w:numPr>
+        <w:pStyle w:val="Compact"/>
+      </w:pPr>
+      <w:r>
+        <w:t xml:space="preserve">Chapter 14: Exodus 1–2</w:t>
+      </w:r>
+    </w:p>
+    <w:p>
+      <w:pPr>
+        <w:numPr>
+          <w:ilvl w:val="1"/>
+          <w:numId w:val="1008"/>
+        </w:numPr>
+        <w:pStyle w:val="Compact"/>
+      </w:pPr>
+      <w:r>
+        <w:t xml:space="preserve">Chapter 10 currently says</w:t>
+      </w:r>
+      <w:r>
+        <w:t xml:space="preserve"> </w:t>
+      </w:r>
+      <w:r>
+        <w:t xml:space="preserve">“</w:t>
+      </w:r>
+      <w:r>
+        <w:t xml:space="preserve">Genesis 39–41</w:t>
+      </w:r>
+      <w:r>
+        <w:t xml:space="preserve">”</w:t>
+      </w:r>
+      <w:r>
+        <w:t xml:space="preserve">, which overlaps Chapter 11. Suggested:</w:t>
+      </w:r>
+      <w:r>
+        <w:t xml:space="preserve"> </w:t>
+      </w:r>
+      <w:r>
+        <w:t xml:space="preserve">“</w:t>
+      </w:r>
+      <w:r>
+        <w:t xml:space="preserve">Genesis 39–40</w:t>
+      </w:r>
+      <w:r>
+        <w:t xml:space="preserve">”</w:t>
+      </w:r>
+      <w:r>
+        <w:t xml:space="preserve">.</w:t>
       </w:r>
     </w:p>
     <w:p>
@@ -2288,626 +3088,120 @@
           <w:bCs/>
           <w:b/>
         </w:rPr>
-        <w:t xml:space="preserve">Cover width must match the new page count:</w:t>
+        <w:t xml:space="preserve">About the Author:</w:t>
+      </w:r>
+      <w:r>
+        <w:t xml:space="preserve"> </w:t>
+      </w:r>
+      <w:r>
+        <w:t xml:space="preserve">KDP will add a blank page 32. You could use it for an About the Author page, if you send a short bio and optional photo.</w:t>
+      </w:r>
+    </w:p>
+    <w:bookmarkEnd w:id="31"/>
+    <w:bookmarkStart w:id="32" w:name="f.-before-you-click-publish"/>
+    <w:p>
+      <w:pPr>
+        <w:pStyle w:val="Heading2"/>
+      </w:pPr>
+      <w:r>
+        <w:t xml:space="preserve">F. Before you click Publish</w:t>
       </w:r>
     </w:p>
     <w:p>
       <w:pPr>
         <w:numPr>
-          <w:ilvl w:val="1"/>
+          <w:ilvl w:val="0"/>
           <w:numId w:val="1009"/>
         </w:numPr>
         <w:pStyle w:val="Compact"/>
       </w:pPr>
       <w:r>
-        <w:t xml:space="preserve">The draft is 17.320 in wide, which is correct for</w:t>
-      </w:r>
-      <w:r>
-        <w:t xml:space="preserve"> </w:t>
-      </w:r>
-      <w:r>
-        <w:rPr>
-          <w:bCs/>
-          <w:b/>
-        </w:rPr>
-        <w:t xml:space="preserve">30</w:t>
-      </w:r>
-      <w:r>
-        <w:t xml:space="preserve"> </w:t>
-      </w:r>
-      <w:r>
-        <w:t xml:space="preserve">pages.</w:t>
+        <w:t xml:space="preserve">Upload</w:t>
+      </w:r>
+      <w:r>
+        <w:t xml:space="preserve"> </w:t>
+      </w:r>
+      <w:r>
+        <w:rPr>
+          <w:rStyle w:val="VerbatimChar"/>
+        </w:rPr>
+        <w:t xml:space="preserve">01_KDP_Interior_Joesiah_Malani_Book1.pdf</w:t>
+      </w:r>
+      <w:r>
+        <w:t xml:space="preserve"> </w:t>
+      </w:r>
+      <w:r>
+        <w:t xml:space="preserve">and choose:</w:t>
+      </w:r>
+      <w:r>
+        <w:t xml:space="preserve"> </w:t>
+      </w:r>
+      <w:r>
+        <w:rPr>
+          <w:bCs/>
+          <w:b/>
+        </w:rPr>
+        <w:t xml:space="preserve">Premium Color · White paper · 8.5 × 11 in · Bleed: Yes · Glossy · Paperback</w:t>
+      </w:r>
+      <w:r>
+        <w:t xml:space="preserve">.</w:t>
       </w:r>
     </w:p>
     <w:p>
       <w:pPr>
         <w:numPr>
-          <w:ilvl w:val="1"/>
+          <w:ilvl w:val="0"/>
           <w:numId w:val="1009"/>
         </w:numPr>
         <w:pStyle w:val="Compact"/>
       </w:pPr>
       <w:r>
-        <w:t xml:space="preserve">The new interior is 31 pages, and KDP will count it as 32 after adding a blank page.</w:t>
+        <w:t xml:space="preserve">Step through</w:t>
+      </w:r>
+      <w:r>
+        <w:t xml:space="preserve"> </w:t>
+      </w:r>
+      <w:r>
+        <w:rPr>
+          <w:bCs/>
+          <w:b/>
+        </w:rPr>
+        <w:t xml:space="preserve">every page</w:t>
+      </w:r>
+      <w:r>
+        <w:t xml:space="preserve"> </w:t>
+      </w:r>
+      <w:r>
+        <w:t xml:space="preserve">in KDP’s Print Previewer, especially pages 6–7.</w:t>
       </w:r>
     </w:p>
     <w:p>
       <w:pPr>
         <w:numPr>
-          <w:ilvl w:val="1"/>
+          <w:ilvl w:val="0"/>
           <w:numId w:val="1009"/>
         </w:numPr>
         <w:pStyle w:val="Compact"/>
       </w:pPr>
       <w:r>
-        <w:t xml:space="preserve">At 32 pages on white paper with premium color, the full-wrap cover must be</w:t>
-      </w:r>
-      <w:r>
-        <w:t xml:space="preserve"> </w:t>
-      </w:r>
-      <w:r>
-        <w:rPr>
-          <w:bCs/>
-          <w:b/>
-        </w:rPr>
-        <w:t xml:space="preserve">17.325 × 11.25 in</w:t>
-      </w:r>
-      <w:r>
-        <w:t xml:space="preserve"> </w:t>
-      </w:r>
-      <w:r>
-        <w:t xml:space="preserve">(spine 0.0751 in).</w:t>
-      </w:r>
-    </w:p>
-    <w:p>
-      <w:pPr>
-        <w:numPr>
-          <w:ilvl w:val="1"/>
-          <w:numId w:val="1009"/>
-        </w:numPr>
-        <w:pStyle w:val="Compact"/>
-      </w:pPr>
-      <w:r>
-        <w:t xml:space="preserve">Use KDP’s cover calculator with the final page count.</w:t>
+        <w:rPr>
+          <w:bCs/>
+          <w:b/>
+        </w:rPr>
+        <w:t xml:space="preserve">AI disclosure:</w:t>
+      </w:r>
+      <w:r>
+        <w:t xml:space="preserve"> </w:t>
+      </w:r>
+      <w:r>
+        <w:t xml:space="preserve">KDP asks whether text or images are AI-generated. Answer accurately for the illustrations.</w:t>
       </w:r>
     </w:p>
     <w:p>
       <w:pPr>
         <w:numPr>
           <w:ilvl w:val="0"/>
-          <w:numId w:val="1007"/>
-        </w:numPr>
-        <w:pStyle w:val="Compact"/>
-      </w:pPr>
-      <w:r>
-        <w:rPr>
-          <w:bCs/>
-          <w:b/>
-        </w:rPr>
-        <w:t xml:space="preserve">Cover resolution:</w:t>
-      </w:r>
-      <w:r>
-        <w:t xml:space="preserve"> </w:t>
-      </w:r>
-      <w:r>
-        <w:t xml:space="preserve">the cover images are only about 86 DPI. Supply higher-resolution cover art.</w:t>
-      </w:r>
-    </w:p>
-    <w:p>
-      <w:pPr>
-        <w:numPr>
-          <w:ilvl w:val="0"/>
-          <w:numId w:val="1007"/>
-        </w:numPr>
-        <w:pStyle w:val="Compact"/>
-      </w:pPr>
-      <w:r>
-        <w:rPr>
-          <w:bCs/>
-          <w:b/>
-        </w:rPr>
-        <w:t xml:space="preserve">Motto mismatch:</w:t>
-      </w:r>
-    </w:p>
-    <w:p>
-      <w:pPr>
-        <w:numPr>
-          <w:ilvl w:val="1"/>
-          <w:numId w:val="1010"/>
-        </w:numPr>
-        <w:pStyle w:val="Compact"/>
-      </w:pPr>
-      <w:r>
-        <w:t xml:space="preserve">The back cover says</w:t>
-      </w:r>
-      <w:r>
-        <w:t xml:space="preserve"> </w:t>
-      </w:r>
-      <w:r>
-        <w:t xml:space="preserve">“</w:t>
-      </w:r>
-      <w:r>
-        <w:t xml:space="preserve">Know Your History. Be Proud of Your Story. Walk in Your Purpose.</w:t>
-      </w:r>
-      <w:r>
-        <w:t xml:space="preserve">”</w:t>
-      </w:r>
-    </w:p>
-    <w:p>
-      <w:pPr>
-        <w:numPr>
-          <w:ilvl w:val="1"/>
-          <w:numId w:val="1010"/>
-        </w:numPr>
-        <w:pStyle w:val="Compact"/>
-      </w:pPr>
-      <w:r>
-        <w:t xml:space="preserve">The interior motto is</w:t>
-      </w:r>
-      <w:r>
-        <w:t xml:space="preserve"> </w:t>
-      </w:r>
-      <w:r>
-        <w:t xml:space="preserve">“</w:t>
-      </w:r>
-      <w:r>
-        <w:t xml:space="preserve">Know the Word. Seek the Truth. Remember who you are. Walk in the purpose God gave you.</w:t>
-      </w:r>
-      <w:r>
-        <w:t xml:space="preserve">”</w:t>
-      </w:r>
-    </w:p>
-    <w:p>
-      <w:pPr>
-        <w:numPr>
-          <w:ilvl w:val="1"/>
-          <w:numId w:val="1010"/>
-        </w:numPr>
-        <w:pStyle w:val="Compact"/>
-      </w:pPr>
-      <w:r>
-        <w:t xml:space="preserve">Choose whether to align them.</w:t>
-      </w:r>
-    </w:p>
-    <w:p>
-      <w:pPr>
-        <w:numPr>
-          <w:ilvl w:val="0"/>
-          <w:numId w:val="1007"/>
-        </w:numPr>
-        <w:pStyle w:val="Compact"/>
-      </w:pPr>
-      <w:r>
-        <w:rPr>
-          <w:bCs/>
-          <w:b/>
-        </w:rPr>
-        <w:t xml:space="preserve">Spine:</w:t>
-      </w:r>
-      <w:r>
-        <w:t xml:space="preserve"> </w:t>
-      </w:r>
-      <w:r>
-        <w:t xml:space="preserve">there is no spine text. That’s correct, because KDP only allows spine text on books over 79 pages.</w:t>
-      </w:r>
-    </w:p>
-    <w:p>
-      <w:pPr>
-        <w:pStyle w:val="FirstParagraph"/>
-      </w:pPr>
-      <w:r>
-        <w:t xml:space="preserve">If you send approved high-resolution cover artwork and ask, I’ll format the full-wrap cover PDF.</w:t>
-      </w:r>
-    </w:p>
-    <w:bookmarkEnd w:id="30"/>
-    <w:bookmarkStart w:id="31" w:name="X24b36e912db8f246a1587d13fa2d01db15236b4"/>
-    <w:p>
-      <w:pPr>
-        <w:pStyle w:val="Heading2"/>
-      </w:pPr>
-      <w:r>
-        <w:t xml:space="preserve">E. Optional editorial suggestions (not applied)</w:t>
-      </w:r>
-    </w:p>
-    <w:p>
-      <w:pPr>
-        <w:numPr>
-          <w:ilvl w:val="0"/>
-          <w:numId w:val="1011"/>
-        </w:numPr>
-        <w:pStyle w:val="Compact"/>
-      </w:pPr>
-      <w:r>
-        <w:t xml:space="preserve">✅</w:t>
-      </w:r>
-      <w:r>
-        <w:t xml:space="preserve"> </w:t>
-      </w:r>
-      <w:r>
-        <w:rPr>
-          <w:bCs/>
-          <w:b/>
-        </w:rPr>
-        <w:t xml:space="preserve">Chapter 4 (done):</w:t>
-      </w:r>
-      <w:r>
-        <w:t xml:space="preserve"> </w:t>
-      </w:r>
-      <w:r>
-        <w:t xml:space="preserve">The text now explains Put and makes the Africa link clear:</w:t>
-      </w:r>
-      <w:r>
-        <w:t xml:space="preserve"> </w:t>
-      </w:r>
-      <w:r>
-        <w:t xml:space="preserve">“</w:t>
-      </w:r>
-      <w:r>
-        <w:t xml:space="preserve">Put is often associated with lands west of Egypt, such as ancient Libya. So three of Ham’s sons—Cush, Mizraim, and Put—are linked with lands in Africa. Canaan’s family settled in the land of Canaan, northeast of Egypt.</w:t>
-      </w:r>
-      <w:r>
-        <w:t xml:space="preserve">”</w:t>
-      </w:r>
-      <w:r>
-        <w:t xml:space="preserve"> </w:t>
-      </w:r>
-      <w:r>
-        <w:t xml:space="preserve">It also has an</w:t>
-      </w:r>
-      <w:r>
-        <w:t xml:space="preserve"> </w:t>
-      </w:r>
-      <w:r>
-        <w:rPr>
-          <w:bCs/>
-          <w:b/>
-        </w:rPr>
-        <w:t xml:space="preserve">“</w:t>
-      </w:r>
-      <w:r>
-        <w:rPr>
-          <w:bCs/>
-          <w:b/>
-        </w:rPr>
-        <w:t xml:space="preserve">On Today’s Map</w:t>
-      </w:r>
-      <w:r>
-        <w:rPr>
-          <w:bCs/>
-          <w:b/>
-        </w:rPr>
-        <w:t xml:space="preserve">”</w:t>
-      </w:r>
-      <w:r>
-        <w:t xml:space="preserve"> </w:t>
-      </w:r>
-      <w:r>
-        <w:t xml:space="preserve">box: Cush (Kush, Nubia) = Sudan and southern Egypt; Mizraim = Egypt; Put = Libya; Canaan = Israel, the Palestinian territories (the West Bank and Gaza), Lebanon, and parts of Syria and Jordan.</w:t>
-      </w:r>
-    </w:p>
-    <w:p>
-      <w:pPr>
-        <w:numPr>
-          <w:ilvl w:val="0"/>
-          <w:numId w:val="1011"/>
-        </w:numPr>
-        <w:pStyle w:val="Compact"/>
-      </w:pPr>
-      <w:r>
-        <w:rPr>
-          <w:bCs/>
-          <w:b/>
-        </w:rPr>
-        <w:t xml:space="preserve">Chapter 5:</w:t>
-      </w:r>
-      <w:r>
-        <w:t xml:space="preserve"> </w:t>
-      </w:r>
-      <w:r>
-        <w:t xml:space="preserve">“</w:t>
-      </w:r>
-      <w:r>
-        <w:t xml:space="preserve">divinely destined for servitude</w:t>
-      </w:r>
-      <w:r>
-        <w:t xml:space="preserve">”</w:t>
-      </w:r>
-      <w:r>
-        <w:t xml:space="preserve"> </w:t>
-      </w:r>
-      <w:r>
-        <w:t xml:space="preserve">is hard vocabulary for ages 8–12. A suggested alternative:</w:t>
-      </w:r>
-      <w:r>
-        <w:t xml:space="preserve"> </w:t>
-      </w:r>
-      <w:r>
-        <w:t xml:space="preserve">“</w:t>
-      </w:r>
-      <w:r>
-        <w:t xml:space="preserve">used to claim that God meant African people to be enslaved, and to defend racial slavery.</w:t>
-      </w:r>
-      <w:r>
-        <w:t xml:space="preserve">”</w:t>
-      </w:r>
-    </w:p>
-    <w:p>
-      <w:pPr>
-        <w:numPr>
-          <w:ilvl w:val="0"/>
-          <w:numId w:val="1011"/>
-        </w:numPr>
-        <w:pStyle w:val="Compact"/>
-      </w:pPr>
-      <w:r>
-        <w:rPr>
-          <w:bCs/>
-          <w:b/>
-        </w:rPr>
-        <w:t xml:space="preserve">Chapter 9</w:t>
-      </w:r>
-      <w:r>
-        <w:t xml:space="preserve"> </w:t>
-      </w:r>
-      <w:r>
-        <w:t xml:space="preserve">repeats Chapter 8’s sentence about Egypt already having rulers, cities and agriculture. You could shorten it to one line.</w:t>
-      </w:r>
-    </w:p>
-    <w:p>
-      <w:pPr>
-        <w:numPr>
-          <w:ilvl w:val="0"/>
-          <w:numId w:val="1011"/>
-        </w:numPr>
-        <w:pStyle w:val="Compact"/>
-      </w:pPr>
-      <w:r>
-        <w:rPr>
-          <w:bCs/>
-          <w:b/>
-        </w:rPr>
-        <w:t xml:space="preserve">“</w:t>
-      </w:r>
-      <w:r>
-        <w:rPr>
-          <w:bCs/>
-          <w:b/>
-        </w:rPr>
-        <w:t xml:space="preserve">Read it for yourself</w:t>
-      </w:r>
-      <w:r>
-        <w:rPr>
-          <w:bCs/>
-          <w:b/>
-        </w:rPr>
-        <w:t xml:space="preserve">”</w:t>
-      </w:r>
-      <w:r>
-        <w:rPr>
-          <w:bCs/>
-          <w:b/>
-        </w:rPr>
-        <w:t xml:space="preserve"> </w:t>
-      </w:r>
-      <w:r>
-        <w:rPr>
-          <w:bCs/>
-          <w:b/>
-        </w:rPr>
-        <w:t xml:space="preserve">lines</w:t>
-      </w:r>
-      <w:r>
-        <w:t xml:space="preserve"> </w:t>
-      </w:r>
-      <w:r>
-        <w:t xml:space="preserve">are missing from Chapters 4, 7, 8, 12, 13 and 14. Suggested additions:</w:t>
-      </w:r>
-    </w:p>
-    <w:p>
-      <w:pPr>
-        <w:numPr>
-          <w:ilvl w:val="1"/>
-          <w:numId w:val="1012"/>
-        </w:numPr>
-        <w:pStyle w:val="Compact"/>
-      </w:pPr>
-      <w:r>
-        <w:t xml:space="preserve">Chapter 4: Genesis 10:6–20</w:t>
-      </w:r>
-    </w:p>
-    <w:p>
-      <w:pPr>
-        <w:numPr>
-          <w:ilvl w:val="1"/>
-          <w:numId w:val="1012"/>
-        </w:numPr>
-        <w:pStyle w:val="Compact"/>
-      </w:pPr>
-      <w:r>
-        <w:t xml:space="preserve">Chapter 12: Genesis 42–50</w:t>
-      </w:r>
-    </w:p>
-    <w:p>
-      <w:pPr>
-        <w:numPr>
-          <w:ilvl w:val="1"/>
-          <w:numId w:val="1012"/>
-        </w:numPr>
-        <w:pStyle w:val="Compact"/>
-      </w:pPr>
-      <w:r>
-        <w:t xml:space="preserve">Chapter 14: Exodus 1–2</w:t>
-      </w:r>
-    </w:p>
-    <w:p>
-      <w:pPr>
-        <w:numPr>
-          <w:ilvl w:val="1"/>
-          <w:numId w:val="1012"/>
-        </w:numPr>
-        <w:pStyle w:val="Compact"/>
-      </w:pPr>
-      <w:r>
-        <w:t xml:space="preserve">Chapter 10 currently says</w:t>
-      </w:r>
-      <w:r>
-        <w:t xml:space="preserve"> </w:t>
-      </w:r>
-      <w:r>
-        <w:t xml:space="preserve">“</w:t>
-      </w:r>
-      <w:r>
-        <w:t xml:space="preserve">Genesis 39–41</w:t>
-      </w:r>
-      <w:r>
-        <w:t xml:space="preserve">”</w:t>
-      </w:r>
-      <w:r>
-        <w:t xml:space="preserve">, which overlaps Chapter 11. Suggested:</w:t>
-      </w:r>
-      <w:r>
-        <w:t xml:space="preserve"> </w:t>
-      </w:r>
-      <w:r>
-        <w:t xml:space="preserve">“</w:t>
-      </w:r>
-      <w:r>
-        <w:t xml:space="preserve">Genesis 39–40</w:t>
-      </w:r>
-      <w:r>
-        <w:t xml:space="preserve">”</w:t>
-      </w:r>
-      <w:r>
-        <w:t xml:space="preserve">.</w:t>
-      </w:r>
-    </w:p>
-    <w:p>
-      <w:pPr>
-        <w:numPr>
-          <w:ilvl w:val="0"/>
-          <w:numId w:val="1011"/>
-        </w:numPr>
-        <w:pStyle w:val="Compact"/>
-      </w:pPr>
-      <w:r>
-        <w:rPr>
-          <w:bCs/>
-          <w:b/>
-        </w:rPr>
-        <w:t xml:space="preserve">About the Author:</w:t>
-      </w:r>
-      <w:r>
-        <w:t xml:space="preserve"> </w:t>
-      </w:r>
-      <w:r>
-        <w:t xml:space="preserve">KDP will add a blank page 32. You could use it for an About the Author page, if you send a short bio and optional photo.</w:t>
-      </w:r>
-    </w:p>
-    <w:bookmarkEnd w:id="31"/>
-    <w:bookmarkStart w:id="32" w:name="f.-before-you-click-publish"/>
-    <w:p>
-      <w:pPr>
-        <w:pStyle w:val="Heading2"/>
-      </w:pPr>
-      <w:r>
-        <w:t xml:space="preserve">F. Before you click Publish</w:t>
-      </w:r>
-    </w:p>
-    <w:p>
-      <w:pPr>
-        <w:numPr>
-          <w:ilvl w:val="0"/>
-          <w:numId w:val="1013"/>
-        </w:numPr>
-        <w:pStyle w:val="Compact"/>
-      </w:pPr>
-      <w:r>
-        <w:t xml:space="preserve">Upload</w:t>
-      </w:r>
-      <w:r>
-        <w:t xml:space="preserve"> </w:t>
-      </w:r>
-      <w:r>
-        <w:rPr>
-          <w:rStyle w:val="VerbatimChar"/>
-        </w:rPr>
-        <w:t xml:space="preserve">01_KDP_Interior_Joesiah_Malani_Book1.pdf</w:t>
-      </w:r>
-      <w:r>
-        <w:t xml:space="preserve"> </w:t>
-      </w:r>
-      <w:r>
-        <w:t xml:space="preserve">and choose:</w:t>
-      </w:r>
-      <w:r>
-        <w:t xml:space="preserve"> </w:t>
-      </w:r>
-      <w:r>
-        <w:rPr>
-          <w:bCs/>
-          <w:b/>
-        </w:rPr>
-        <w:t xml:space="preserve">Premium Color · White paper · 8.5 × 11 in · Bleed: Yes · Glossy · Paperback</w:t>
-      </w:r>
-      <w:r>
-        <w:t xml:space="preserve">.</w:t>
-      </w:r>
-    </w:p>
-    <w:p>
-      <w:pPr>
-        <w:numPr>
-          <w:ilvl w:val="0"/>
-          <w:numId w:val="1013"/>
-        </w:numPr>
-        <w:pStyle w:val="Compact"/>
-      </w:pPr>
-      <w:r>
-        <w:t xml:space="preserve">Step through</w:t>
-      </w:r>
-      <w:r>
-        <w:t xml:space="preserve"> </w:t>
-      </w:r>
-      <w:r>
-        <w:rPr>
-          <w:bCs/>
-          <w:b/>
-        </w:rPr>
-        <w:t xml:space="preserve">every page</w:t>
-      </w:r>
-      <w:r>
-        <w:t xml:space="preserve"> </w:t>
-      </w:r>
-      <w:r>
-        <w:t xml:space="preserve">in KDP’s Print Previewer, especially pages 6–7.</w:t>
-      </w:r>
-    </w:p>
-    <w:p>
-      <w:pPr>
-        <w:numPr>
-          <w:ilvl w:val="0"/>
-          <w:numId w:val="1013"/>
-        </w:numPr>
-        <w:pStyle w:val="Compact"/>
-      </w:pPr>
-      <w:r>
-        <w:rPr>
-          <w:bCs/>
-          <w:b/>
-        </w:rPr>
-        <w:t xml:space="preserve">AI disclosure:</w:t>
-      </w:r>
-      <w:r>
-        <w:t xml:space="preserve"> </w:t>
-      </w:r>
-      <w:r>
-        <w:t xml:space="preserve">KDP asks whether text or images are AI-generated. Answer accurately for the illustrations.</w:t>
-      </w:r>
-    </w:p>
-    <w:p>
-      <w:pPr>
-        <w:numPr>
-          <w:ilvl w:val="0"/>
-          <w:numId w:val="1013"/>
+          <w:numId w:val="1009"/>
         </w:numPr>
         <w:pStyle w:val="Compact"/>
       </w:pPr>
@@ -3103,91 +3397,6 @@
     <w:lvl w:ilvl="8">
       <w:numFmt w:val="bullet"/>
       <w:lvlText w:val="•"/>
-      <w:lvlJc w:val="left"/>
-      <w:pPr>
-        <w:ind w:left="6480" w:hanging="480"/>
-      </w:pPr>
-    </w:lvl>
-  </w:abstractNum>
-  <w:abstractNum w:abstractNumId="99419">
-    <w:nsid w:val="A99419"/>
-    <w:multiLevelType w:val="multilevel"/>
-    <w:lvl w:ilvl="0">
-      <w:start w:val="9"/>
-      <w:numFmt w:val="decimal"/>
-      <w:lvlText w:val="%1."/>
-      <w:lvlJc w:val="left"/>
-      <w:pPr>
-        <w:ind w:left="720" w:hanging="480"/>
-      </w:pPr>
-    </w:lvl>
-    <w:lvl w:ilvl="1">
-      <w:start w:val="9"/>
-      <w:numFmt w:val="decimal"/>
-      <w:lvlText w:val="%2."/>
-      <w:lvlJc w:val="left"/>
-      <w:pPr>
-        <w:ind w:left="1440" w:hanging="480"/>
-      </w:pPr>
-    </w:lvl>
-    <w:lvl w:ilvl="2">
-      <w:start w:val="9"/>
-      <w:numFmt w:val="decimal"/>
-      <w:lvlText w:val="%3."/>
-      <w:lvlJc w:val="left"/>
-      <w:pPr>
-        <w:ind w:left="2160" w:hanging="480"/>
-      </w:pPr>
-    </w:lvl>
-    <w:lvl w:ilvl="3">
-      <w:start w:val="9"/>
-      <w:numFmt w:val="decimal"/>
-      <w:lvlText w:val="%4."/>
-      <w:lvlJc w:val="left"/>
-      <w:pPr>
-        <w:ind w:left="2880" w:hanging="480"/>
-      </w:pPr>
-    </w:lvl>
-    <w:lvl w:ilvl="4">
-      <w:start w:val="9"/>
-      <w:numFmt w:val="decimal"/>
-      <w:lvlText w:val="%5."/>
-      <w:lvlJc w:val="left"/>
-      <w:pPr>
-        <w:ind w:left="3600" w:hanging="480"/>
-      </w:pPr>
-    </w:lvl>
-    <w:lvl w:ilvl="5">
-      <w:start w:val="9"/>
-      <w:numFmt w:val="decimal"/>
-      <w:lvlText w:val="%6."/>
-      <w:lvlJc w:val="left"/>
-      <w:pPr>
-        <w:ind w:left="4320" w:hanging="480"/>
-      </w:pPr>
-    </w:lvl>
-    <w:lvl w:ilvl="6">
-      <w:start w:val="9"/>
-      <w:numFmt w:val="decimal"/>
-      <w:lvlText w:val="%7."/>
-      <w:lvlJc w:val="left"/>
-      <w:pPr>
-        <w:ind w:left="5040" w:hanging="480"/>
-      </w:pPr>
-    </w:lvl>
-    <w:lvl w:ilvl="7">
-      <w:start w:val="9"/>
-      <w:numFmt w:val="decimal"/>
-      <w:lvlText w:val="%8."/>
-      <w:lvlJc w:val="left"/>
-      <w:pPr>
-        <w:ind w:left="5760" w:hanging="480"/>
-      </w:pPr>
-    </w:lvl>
-    <w:lvl w:ilvl="8">
-      <w:start w:val="9"/>
-      <w:numFmt w:val="decimal"/>
-      <w:lvlText w:val="%9."/>
       <w:lvlJc w:val="left"/>
       <w:pPr>
         <w:ind w:left="6480" w:hanging="480"/>
@@ -3301,45 +3510,6 @@
     <w:abstractNumId w:val="991"/>
   </w:num>
   <w:num w:numId="1007">
-    <w:abstractNumId w:val="99419"/>
-    <w:lvlOverride w:ilvl="0">
-      <w:startOverride w:val="9"/>
-    </w:lvlOverride>
-    <w:lvlOverride w:ilvl="1">
-      <w:startOverride w:val="9"/>
-    </w:lvlOverride>
-    <w:lvlOverride w:ilvl="2">
-      <w:startOverride w:val="9"/>
-    </w:lvlOverride>
-    <w:lvlOverride w:ilvl="3">
-      <w:startOverride w:val="9"/>
-    </w:lvlOverride>
-    <w:lvlOverride w:ilvl="4">
-      <w:startOverride w:val="9"/>
-    </w:lvlOverride>
-    <w:lvlOverride w:ilvl="5">
-      <w:startOverride w:val="9"/>
-    </w:lvlOverride>
-    <w:lvlOverride w:ilvl="6">
-      <w:startOverride w:val="9"/>
-    </w:lvlOverride>
-    <w:lvlOverride w:ilvl="7">
-      <w:startOverride w:val="9"/>
-    </w:lvlOverride>
-    <w:lvlOverride w:ilvl="8">
-      <w:startOverride w:val="9"/>
-    </w:lvlOverride>
-  </w:num>
-  <w:num w:numId="1008">
-    <w:abstractNumId w:val="991"/>
-  </w:num>
-  <w:num w:numId="1009">
-    <w:abstractNumId w:val="991"/>
-  </w:num>
-  <w:num w:numId="1010">
-    <w:abstractNumId w:val="991"/>
-  </w:num>
-  <w:num w:numId="1011">
     <w:abstractNumId w:val="994114"/>
     <w:lvlOverride w:ilvl="0">
       <w:startOverride w:val="14"/>
@@ -3369,10 +3539,10 @@
       <w:startOverride w:val="14"/>
     </w:lvlOverride>
   </w:num>
-  <w:num w:numId="1012">
+  <w:num w:numId="1008">
     <w:abstractNumId w:val="991"/>
   </w:num>
-  <w:num w:numId="1013">
+  <w:num w:numId="1009">
     <w:abstractNumId w:val="991"/>
   </w:num>
 </w:numbering>

</xml_diff>

<commit_message>
Add 'BOOK 1' under the title on the front cover
Set in the gold rule between NOAH'S BLOODLINE and the subtitle, replacing
the small ankh ornament, in the title's navy (Cinzel Bold).

Co-Authored-By: Claude Opus 5.5 <noreply@anthropic.com>
Claude-Session: https://claude.ai/code/session_01MoWmDNVtH34VN9ywvoYJRo
</commit_message>
<xml_diff>
--- a/deliverables/04_Open_Issues_For_Approval.docx
+++ b/deliverables/04_Open_Issues_For_Approval.docx
@@ -2334,19 +2334,19 @@
               <w:jc w:val="left"/>
             </w:pPr>
             <w:r>
-              <w:t xml:space="preserve">Author</w:t>
-            </w:r>
-          </w:p>
-        </w:tc>
-        <w:tc>
-          <w:tcPr/>
-          <w:p>
-            <w:pPr>
-              <w:pStyle w:val="Compact"/>
-              <w:jc w:val="left"/>
-            </w:pPr>
-            <w:r>
-              <w:t xml:space="preserve">Banner relettered to</w:t>
+              <w:t xml:space="preserve">Book number</w:t>
+            </w:r>
+          </w:p>
+        </w:tc>
+        <w:tc>
+          <w:tcPr/>
+          <w:p>
+            <w:pPr>
+              <w:pStyle w:val="Compact"/>
+              <w:jc w:val="left"/>
+            </w:pPr>
+            <w:r>
+              <w:t xml:space="preserve">✅</w:t>
             </w:r>
             <w:r>
               <w:t xml:space="preserve"> </w:t>
@@ -2363,7 +2363,7 @@
                 <w:bCs/>
                 <w:b/>
               </w:rPr>
-              <w:t xml:space="preserve">By LeTisha C. Cleveland</w:t>
+              <w:t xml:space="preserve">BOOK 1</w:t>
             </w:r>
             <w:r>
               <w:rPr>
@@ -2373,6 +2373,80 @@
               <w:t xml:space="preserve">”</w:t>
             </w:r>
             <w:r>
+              <w:t xml:space="preserve"> </w:t>
+            </w:r>
+            <w:r>
+              <w:t xml:space="preserve">added under the title, in the gold rule between</w:t>
+            </w:r>
+            <w:r>
+              <w:t xml:space="preserve"> </w:t>
+            </w:r>
+            <w:r>
+              <w:t xml:space="preserve">“</w:t>
+            </w:r>
+            <w:r>
+              <w:t xml:space="preserve">NOAH’S BLOODLINE</w:t>
+            </w:r>
+            <w:r>
+              <w:t xml:space="preserve">”</w:t>
+            </w:r>
+            <w:r>
+              <w:t xml:space="preserve"> </w:t>
+            </w:r>
+            <w:r>
+              <w:t xml:space="preserve">and the subtitle. It replaces the small ankh there and uses the title’s navy.</w:t>
+            </w:r>
+          </w:p>
+        </w:tc>
+      </w:tr>
+      <w:tr>
+        <w:tc>
+          <w:tcPr/>
+          <w:p>
+            <w:pPr>
+              <w:pStyle w:val="Compact"/>
+              <w:jc w:val="left"/>
+            </w:pPr>
+            <w:r>
+              <w:t xml:space="preserve">Author</w:t>
+            </w:r>
+          </w:p>
+        </w:tc>
+        <w:tc>
+          <w:tcPr/>
+          <w:p>
+            <w:pPr>
+              <w:pStyle w:val="Compact"/>
+              <w:jc w:val="left"/>
+            </w:pPr>
+            <w:r>
+              <w:t xml:space="preserve">Banner relettered to</w:t>
+            </w:r>
+            <w:r>
+              <w:t xml:space="preserve"> </w:t>
+            </w:r>
+            <w:r>
+              <w:rPr>
+                <w:bCs/>
+                <w:b/>
+              </w:rPr>
+              <w:t xml:space="preserve">“</w:t>
+            </w:r>
+            <w:r>
+              <w:rPr>
+                <w:bCs/>
+                <w:b/>
+              </w:rPr>
+              <w:t xml:space="preserve">By LeTisha C. Cleveland</w:t>
+            </w:r>
+            <w:r>
+              <w:rPr>
+                <w:bCs/>
+                <w:b/>
+              </w:rPr>
+              <w:t xml:space="preserve">”</w:t>
+            </w:r>
+            <w:r>
               <w:t xml:space="preserve">, in matching gold. It now matches the interior.</w:t>
             </w:r>
           </w:p>
@@ -2770,27 +2844,6 @@
       </w:r>
       <w:r>
         <w:t xml:space="preserve">. That’s fine if time travel is part of the story’s concept. It doesn’t repeat the old series name.</w:t>
-      </w:r>
-      <w:r>
-        <w:t xml:space="preserve"> </w:t>
-      </w:r>
-      <w:r>
-        <w:t xml:space="preserve">- The front cover doesn’t say</w:t>
-      </w:r>
-      <w:r>
-        <w:t xml:space="preserve"> </w:t>
-      </w:r>
-      <w:r>
-        <w:t xml:space="preserve">“</w:t>
-      </w:r>
-      <w:r>
-        <w:t xml:space="preserve">Book 1</w:t>
-      </w:r>
-      <w:r>
-        <w:t xml:space="preserve">”</w:t>
-      </w:r>
-      <w:r>
-        <w:t xml:space="preserve">. It’s optional, and can be added under the title if you want.</w:t>
       </w:r>
     </w:p>
     <w:bookmarkEnd w:id="30"/>

</xml_diff>

<commit_message>
Match the back-cover motto to the book's motto
Replace 'Know Your History. Be Proud of Your Story. Walk in Your Purpose.'
with 'Know the Word. Seek the Truth. Remember who you are. Walk in the
purpose God gave you.' in the same maroon semibold italic (EB Garamond).

Co-Authored-By: Claude Opus 5.5 <noreply@anthropic.com>
Claude-Session: https://claude.ai/code/session_01MoWmDNVtH34VN9ywvoYJRo
</commit_message>
<xml_diff>
--- a/deliverables/04_Open_Issues_For_Approval.docx
+++ b/deliverables/04_Open_Issues_For_Approval.docx
@@ -2408,19 +2408,19 @@
               <w:jc w:val="left"/>
             </w:pPr>
             <w:r>
-              <w:t xml:space="preserve">Author</w:t>
-            </w:r>
-          </w:p>
-        </w:tc>
-        <w:tc>
-          <w:tcPr/>
-          <w:p>
-            <w:pPr>
-              <w:pStyle w:val="Compact"/>
-              <w:jc w:val="left"/>
-            </w:pPr>
-            <w:r>
-              <w:t xml:space="preserve">Banner relettered to</w:t>
+              <w:t xml:space="preserve">Back-cover motto</w:t>
+            </w:r>
+          </w:p>
+        </w:tc>
+        <w:tc>
+          <w:tcPr/>
+          <w:p>
+            <w:pPr>
+              <w:pStyle w:val="Compact"/>
+              <w:jc w:val="left"/>
+            </w:pPr>
+            <w:r>
+              <w:t xml:space="preserve">✅ Changed to match the book:</w:t>
             </w:r>
             <w:r>
               <w:t xml:space="preserve"> </w:t>
@@ -2437,7 +2437,7 @@
                 <w:bCs/>
                 <w:b/>
               </w:rPr>
-              <w:t xml:space="preserve">By LeTisha C. Cleveland</w:t>
+              <w:t xml:space="preserve">Know the Word. / Seek the Truth. / Remember who you are. / Walk in the purpose God gave you.</w:t>
             </w:r>
             <w:r>
               <w:rPr>
@@ -2447,6 +2447,62 @@
               <w:t xml:space="preserve">”</w:t>
             </w:r>
             <w:r>
+              <w:t xml:space="preserve"> </w:t>
+            </w:r>
+            <w:r>
+              <w:t xml:space="preserve">Same maroon italic style, centred under the ankh.</w:t>
+            </w:r>
+          </w:p>
+        </w:tc>
+      </w:tr>
+      <w:tr>
+        <w:tc>
+          <w:tcPr/>
+          <w:p>
+            <w:pPr>
+              <w:pStyle w:val="Compact"/>
+              <w:jc w:val="left"/>
+            </w:pPr>
+            <w:r>
+              <w:t xml:space="preserve">Author</w:t>
+            </w:r>
+          </w:p>
+        </w:tc>
+        <w:tc>
+          <w:tcPr/>
+          <w:p>
+            <w:pPr>
+              <w:pStyle w:val="Compact"/>
+              <w:jc w:val="left"/>
+            </w:pPr>
+            <w:r>
+              <w:t xml:space="preserve">Banner relettered to</w:t>
+            </w:r>
+            <w:r>
+              <w:t xml:space="preserve"> </w:t>
+            </w:r>
+            <w:r>
+              <w:rPr>
+                <w:bCs/>
+                <w:b/>
+              </w:rPr>
+              <w:t xml:space="preserve">“</w:t>
+            </w:r>
+            <w:r>
+              <w:rPr>
+                <w:bCs/>
+                <w:b/>
+              </w:rPr>
+              <w:t xml:space="preserve">By LeTisha C. Cleveland</w:t>
+            </w:r>
+            <w:r>
+              <w:rPr>
+                <w:bCs/>
+                <w:b/>
+              </w:rPr>
+              <w:t xml:space="preserve">”</w:t>
+            </w:r>
+            <w:r>
               <w:t xml:space="preserve">, in matching gold. It now matches the interior.</w:t>
             </w:r>
           </w:p>
@@ -2805,24 +2861,6 @@
           <w:b/>
         </w:rPr>
         <w:t xml:space="preserve">Optional wording on the cover (not changed):</w:t>
-      </w:r>
-      <w:r>
-        <w:t xml:space="preserve"> </w:t>
-      </w:r>
-      <w:r>
-        <w:t xml:space="preserve">- The back-cover motto (</w:t>
-      </w:r>
-      <w:r>
-        <w:t xml:space="preserve">“</w:t>
-      </w:r>
-      <w:r>
-        <w:t xml:space="preserve">Know Your History. Be Proud of Your Story. Walk in Your Purpose.</w:t>
-      </w:r>
-      <w:r>
-        <w:t xml:space="preserve">”</w:t>
-      </w:r>
-      <w:r>
-        <w:t xml:space="preserve">) differs from the motto inside the book.</w:t>
       </w:r>
       <w:r>
         <w:t xml:space="preserve"> </w:t>

</xml_diff>

<commit_message>
Book 1: match title to KDP listing (Time Travel Adventure, Part 1)
Title page, copyright page, end preview, PDF metadata and front cover now
read 'Joesiah & Malani Time Travel Adventure: Part 1: Noah's Bloodline'.
Restores the original 'Part' wording in the Chapter 13 and Part 2 art.

Co-Authored-By: Claude Opus 5.5 <noreply@anthropic.com>
Claude-Session: https://claude.ai/code/session_01MoWmDNVtH34VN9ywvoYJRo
</commit_message>
<xml_diff>
--- a/deliverables/04_Open_Issues_For_Approval.docx
+++ b/deliverables/04_Open_Issues_For_Approval.docx
@@ -2,7 +2,7 @@
 <file path=word/document.xml><?xml version="1.0" encoding="utf-8"?>
 <w:document xmlns:w="http://schemas.openxmlformats.org/wordprocessingml/2006/main" xmlns:m="http://schemas.openxmlformats.org/officeDocument/2006/math" xmlns:r="http://schemas.openxmlformats.org/officeDocument/2006/relationships" xmlns:o="urn:schemas-microsoft-com:office:office" xmlns:v="urn:schemas-microsoft-com:vml" xmlns:w10="urn:schemas-microsoft-com:office:word" xmlns:a="http://schemas.openxmlformats.org/drawingml/2006/main" xmlns:pic="http://schemas.openxmlformats.org/drawingml/2006/picture" xmlns:wp="http://schemas.openxmlformats.org/drawingml/2006/wordprocessingDrawing">
   <w:body>
-    <w:bookmarkStart w:id="33" w:name="X867c384ec273513ba45119e63f0eaa75ddce729"/>
+    <w:bookmarkStart w:id="34" w:name="X867c384ec273513ba45119e63f0eaa75ddce729"/>
     <w:p>
       <w:pPr>
         <w:pStyle w:val="Heading1"/>
@@ -3310,8 +3310,285 @@
         <w:t xml:space="preserve">before publishing, to check colours and how sharp the small lettering inside the art prints.</w:t>
       </w:r>
     </w:p>
+    <w:p>
+      <w:r>
+        <w:pict>
+          <v:rect style="width:0;height:1.5pt" o:hralign="center" o:hrstd="t" o:hr="t"/>
+        </w:pict>
+      </w:r>
+    </w:p>
     <w:bookmarkEnd w:id="32"/>
+    <w:bookmarkStart w:id="33" w:name="Xbeebc53a0a0942e126cfbba11f7125686278998"/>
+    <w:p>
+      <w:pPr>
+        <w:pStyle w:val="Heading2"/>
+      </w:pPr>
+      <w:r>
+        <w:t xml:space="preserve">Update: title matched to KDP (author request)</w:t>
+      </w:r>
+    </w:p>
+    <w:p>
+      <w:pPr>
+        <w:pStyle w:val="FirstParagraph"/>
+      </w:pPr>
+      <w:r>
+        <w:t xml:space="preserve">The book now uses the title entered in KDP:</w:t>
+      </w:r>
+      <w:r>
+        <w:t xml:space="preserve"> </w:t>
+      </w:r>
+      <w:r>
+        <w:rPr>
+          <w:bCs/>
+          <w:b/>
+        </w:rPr>
+        <w:t xml:space="preserve">Joesiah &amp; Malani Time Travel Adventure: Part 1: Noah’s Bloodline</w:t>
+      </w:r>
+      <w:r>
+        <w:t xml:space="preserve">.</w:t>
+      </w:r>
+      <w:r>
+        <w:t xml:space="preserve"> </w:t>
+      </w:r>
+      <w:r>
+        <w:t xml:space="preserve">-</w:t>
+      </w:r>
+      <w:r>
+        <w:t xml:space="preserve"> </w:t>
+      </w:r>
+      <w:r>
+        <w:rPr>
+          <w:bCs/>
+          <w:b/>
+        </w:rPr>
+        <w:t xml:space="preserve">Title page and copyright page:</w:t>
+      </w:r>
+      <w:r>
+        <w:t xml:space="preserve"> </w:t>
+      </w:r>
+      <w:r>
+        <w:t xml:space="preserve">“</w:t>
+      </w:r>
+      <w:r>
+        <w:t xml:space="preserve">Time Travel Adventure</w:t>
+      </w:r>
+      <w:r>
+        <w:t xml:space="preserve">”</w:t>
+      </w:r>
+      <w:r>
+        <w:t xml:space="preserve"> </w:t>
+      </w:r>
+      <w:r>
+        <w:t xml:space="preserve">and</w:t>
+      </w:r>
+      <w:r>
+        <w:t xml:space="preserve"> </w:t>
+      </w:r>
+      <w:r>
+        <w:t xml:space="preserve">“</w:t>
+      </w:r>
+      <w:r>
+        <w:t xml:space="preserve">Part 1</w:t>
+      </w:r>
+      <w:r>
+        <w:t xml:space="preserve">”</w:t>
+      </w:r>
+      <w:r>
+        <w:t xml:space="preserve">.</w:t>
+      </w:r>
+      <w:r>
+        <w:t xml:space="preserve"> </w:t>
+      </w:r>
+      <w:r>
+        <w:t xml:space="preserve">-</w:t>
+      </w:r>
+      <w:r>
+        <w:t xml:space="preserve"> </w:t>
+      </w:r>
+      <w:r>
+        <w:rPr>
+          <w:bCs/>
+          <w:b/>
+        </w:rPr>
+        <w:t xml:space="preserve">Last page:</w:t>
+      </w:r>
+      <w:r>
+        <w:t xml:space="preserve"> </w:t>
+      </w:r>
+      <w:r>
+        <w:t xml:space="preserve">the preview reads</w:t>
+      </w:r>
+      <w:r>
+        <w:t xml:space="preserve"> </w:t>
+      </w:r>
+      <w:r>
+        <w:t xml:space="preserve">“</w:t>
+      </w:r>
+      <w:r>
+        <w:t xml:space="preserve">Joesiah &amp; Malani Time Travel Adventure • Part 2</w:t>
+      </w:r>
+      <w:r>
+        <w:t xml:space="preserve">”</w:t>
+      </w:r>
+      <w:r>
+        <w:t xml:space="preserve">.</w:t>
+      </w:r>
+      <w:r>
+        <w:t xml:space="preserve"> </w:t>
+      </w:r>
+      <w:r>
+        <w:t xml:space="preserve">-</w:t>
+      </w:r>
+      <w:r>
+        <w:t xml:space="preserve"> </w:t>
+      </w:r>
+      <w:r>
+        <w:rPr>
+          <w:bCs/>
+          <w:b/>
+        </w:rPr>
+        <w:t xml:space="preserve">Artwork:</w:t>
+      </w:r>
+      <w:r>
+        <w:t xml:space="preserve"> </w:t>
+      </w:r>
+      <w:r>
+        <w:t xml:space="preserve">the Chapter 13 art (</w:t>
+      </w:r>
+      <w:r>
+        <w:t xml:space="preserve">“</w:t>
+      </w:r>
+      <w:r>
+        <w:t xml:space="preserve">Key Lessons from Part 1</w:t>
+      </w:r>
+      <w:r>
+        <w:t xml:space="preserve">”</w:t>
+      </w:r>
+      <w:r>
+        <w:t xml:space="preserve">) and the Part 2 preview art are back to their original</w:t>
+      </w:r>
+      <w:r>
+        <w:t xml:space="preserve"> </w:t>
+      </w:r>
+      <w:r>
+        <w:t xml:space="preserve">“</w:t>
+      </w:r>
+      <w:r>
+        <w:t xml:space="preserve">Part</w:t>
+      </w:r>
+      <w:r>
+        <w:t xml:space="preserve">”</w:t>
+      </w:r>
+      <w:r>
+        <w:t xml:space="preserve"> </w:t>
+      </w:r>
+      <w:r>
+        <w:t xml:space="preserve">wording.</w:t>
+      </w:r>
+      <w:r>
+        <w:t xml:space="preserve"> </w:t>
+      </w:r>
+      <w:r>
+        <w:t xml:space="preserve">-</w:t>
+      </w:r>
+      <w:r>
+        <w:t xml:space="preserve"> </w:t>
+      </w:r>
+      <w:r>
+        <w:rPr>
+          <w:bCs/>
+          <w:b/>
+        </w:rPr>
+        <w:t xml:space="preserve">Front cover:</w:t>
+      </w:r>
+      <w:r>
+        <w:t xml:space="preserve"> </w:t>
+      </w:r>
+      <w:r>
+        <w:t xml:space="preserve">“</w:t>
+      </w:r>
+      <w:r>
+        <w:t xml:space="preserve">TIME TRAVEL ADVENTURE • PART 1</w:t>
+      </w:r>
+      <w:r>
+        <w:t xml:space="preserve">”</w:t>
+      </w:r>
+      <w:r>
+        <w:t xml:space="preserve"> </w:t>
+      </w:r>
+      <w:r>
+        <w:t xml:space="preserve">under the title.</w:t>
+      </w:r>
+      <w:r>
+        <w:t xml:space="preserve"> </w:t>
+      </w:r>
+      <w:r>
+        <w:t xml:space="preserve">-</w:t>
+      </w:r>
+      <w:r>
+        <w:t xml:space="preserve"> </w:t>
+      </w:r>
+      <w:r>
+        <w:rPr>
+          <w:bCs/>
+          <w:b/>
+        </w:rPr>
+        <w:t xml:space="preserve">KDP fields:</w:t>
+      </w:r>
+      <w:r>
+        <w:t xml:space="preserve"> </w:t>
+      </w:r>
+      <w:r>
+        <w:t xml:space="preserve">the Title field should read</w:t>
+      </w:r>
+      <w:r>
+        <w:t xml:space="preserve"> </w:t>
+      </w:r>
+      <w:r>
+        <w:t xml:space="preserve">“</w:t>
+      </w:r>
+      <w:r>
+        <w:t xml:space="preserve">Joesiah &amp; Malani Time Travel Adventure</w:t>
+      </w:r>
+      <w:r>
+        <w:t xml:space="preserve">”</w:t>
+      </w:r>
+      <w:r>
+        <w:t xml:space="preserve">, the Subtitle</w:t>
+      </w:r>
+      <w:r>
+        <w:t xml:space="preserve"> </w:t>
+      </w:r>
+      <w:r>
+        <w:t xml:space="preserve">“</w:t>
+      </w:r>
+      <w:r>
+        <w:t xml:space="preserve">Part 1: Noah’s Bloodline</w:t>
+      </w:r>
+      <w:r>
+        <w:t xml:space="preserve">”</w:t>
+      </w:r>
+      <w:r>
+        <w:t xml:space="preserve">, and the Author</w:t>
+      </w:r>
+      <w:r>
+        <w:t xml:space="preserve"> </w:t>
+      </w:r>
+      <w:r>
+        <w:t xml:space="preserve">“</w:t>
+      </w:r>
+      <w:r>
+        <w:t xml:space="preserve">LeTisha C. Cleveland</w:t>
+      </w:r>
+      <w:r>
+        <w:t xml:space="preserve">”</w:t>
+      </w:r>
+      <w:r>
+        <w:t xml:space="preserve">.</w:t>
+      </w:r>
+    </w:p>
     <w:bookmarkEnd w:id="33"/>
+    <w:bookmarkEnd w:id="34"/>
     <w:sectPr/>
   </w:body>
 </w:document>

</xml_diff>